<commit_message>
docs: update supervisor review docs per Taylor's review
</commit_message>
<xml_diff>
--- a/docs/meetings/sprint11_supervisor_review.docx
+++ b/docs/meetings/sprint11_supervisor_review.docx
@@ -14,7 +14,7 @@
           <w:sz w:val="32"/>
           <w:szCs w:val="32"/>
         </w:rPr>
-        <w:t>SPRINT 11 — SPONSOR REVIEW</w:t>
+        <w:t xml:space="preserve">SPRINT 11 — SUPERVISOR REVIEW</w:t>
       </w:r>
     </w:p>
     <w:p/>
@@ -23,21 +23,12 @@
         <w:spacing w:after="80"/>
         <w:jc w:val="center"/>
       </w:pPr>
-      <w:proofErr w:type="spellStart"/>
       <w:r>
         <w:rPr>
           <w:b/>
           <w:bCs/>
         </w:rPr>
-        <w:t>EduRAG</w:t>
-      </w:r>
-      <w:proofErr w:type="spellEnd"/>
-      <w:r>
-        <w:rPr>
-          <w:b/>
-          <w:bCs/>
-        </w:rPr>
-        <w:t>: An AI-Powered Course Assistant Using Retrieval-Augmented Generation</w:t>
+        <w:t>EduRAG: An AI-Powered Course Assistant Using Retrieval-Augmented Generation</w:t>
       </w:r>
     </w:p>
     <w:p>
@@ -78,21 +69,7 @@
         <w:spacing w:after="80"/>
       </w:pPr>
       <w:r>
-        <w:t xml:space="preserve">Sprint 11 ran from 30 September to </w:t>
-      </w:r>
-      <w:r>
-        <w:t>30</w:t>
-      </w:r>
-      <w:r>
-        <w:t xml:space="preserve"> October 2026, focused on closing out the project: freezing the code and fixing the remaining bugs, finalising the A5 (Final Product and Documentation) and A6 (Marketing &amp; Technical Presentation) deliverables, and preparing for the Spring </w:t>
-      </w:r>
-      <w:proofErr w:type="spellStart"/>
-      <w:r>
-        <w:t>TechExpo</w:t>
-      </w:r>
-      <w:proofErr w:type="spellEnd"/>
-      <w:r>
-        <w:t>. This document summarises the outcomes of the Sprint 11 sponsor review meeting (Meeting No. 23) held with Prof. Jun Yan on 14 October 2026.</w:t>
+        <w:t xml:space="preserve">Sprint 11 runs from 30 September to 30 October 2026, focused on closing out the project: freezing the code and fixing the remaining bugs, finalising the A5 (Final Product and Documentation) and A6 (Marketing &amp; Technical Presentation) deliverables, and preparing for the Spring TechExpo. This document summarises the outcomes of the Sprint 11 supervisor review meeting (Meeting No. 23) held with Prof. Jun Yan on 14 October 2026.</w:t>
       </w:r>
     </w:p>
     <w:p>
@@ -147,7 +124,7 @@
         <w:spacing w:after="60"/>
       </w:pPr>
       <w:r>
-        <w:t>The product is in good condition following the sponsor feedback from the previous sponsor meeting.</w:t>
+        <w:t xml:space="preserve">The product is in good condition following the supervisor feedback from the previous supervisor meeting.</w:t>
       </w:r>
     </w:p>
     <w:p>
@@ -160,15 +137,7 @@
         <w:spacing w:after="60"/>
       </w:pPr>
       <w:r>
-        <w:t xml:space="preserve">No further feature development is planned; the remaining effort is A5 and A6 documentation, the </w:t>
-      </w:r>
-      <w:proofErr w:type="spellStart"/>
-      <w:r>
-        <w:t>TechExpo</w:t>
-      </w:r>
-      <w:proofErr w:type="spellEnd"/>
-      <w:r>
-        <w:t xml:space="preserve"> poster, the 2-minute video and the demo.</w:t>
+        <w:t xml:space="preserve">No further feature development is planned; the remaining effort is A5 and A6 documentation, the TechExpo poster, the 2-minute video and the demo.</w:t>
       </w:r>
     </w:p>
     <w:p>
@@ -234,7 +203,7 @@
         <w:spacing w:after="60"/>
       </w:pPr>
       <w:r>
-        <w:t>Demo limitation: the shared screen was too blurry for the sponsor and other attendees to read (a network or screen-resolution issue, not specific to Webex), so the demo was stopped before the student question-and-answer step. The sponsor has therefore not directly verified the updated flow; the team gave a verbal scenario instead.</w:t>
+        <w:t xml:space="preserve">Demo limitation: the shared screen was too blurry for the supervisor and other attendees to read (a network or screen-resolution issue, not specific to Webex), so the demo was stopped before the student question-and-answer step. The supervisor has therefore not directly verified the updated flow; the team gave a verbal scenario instead.</w:t>
       </w:r>
     </w:p>
     <w:p>
@@ -261,10 +230,7 @@
         <w:spacing w:after="60"/>
       </w:pPr>
       <w:r>
-        <w:t>A5 (Final Product and Documentation, due Fri 23 October 2026, 11:00 PM): the documentation is being finalised and checked against every marking criterion in the A5 specification</w:t>
-      </w:r>
-      <w:r>
-        <w:t>.</w:t>
+        <w:t>A5 (Final Product and Documentation, due Fri 23 October 2026, 11:00 PM): the documentation is being finalised and checked against every marking criterion in the A5 specification.</w:t>
       </w:r>
     </w:p>
     <w:p>
@@ -291,15 +257,7 @@
       </w:pPr>
       <w:r>
         <w:lastRenderedPageBreak/>
-        <w:t xml:space="preserve">A6 (Marketing &amp; Technical Presentation, due Fri 30 October 2026, 11:00 PM): not yet started. The plan is to reuse the </w:t>
-      </w:r>
-      <w:proofErr w:type="spellStart"/>
-      <w:r>
-        <w:t>TechExpo</w:t>
-      </w:r>
-      <w:proofErr w:type="spellEnd"/>
-      <w:r>
-        <w:t xml:space="preserve"> video, poster and Q&amp;A material.</w:t>
+        <w:t xml:space="preserve">A6 (Marketing &amp; Technical Presentation, due Fri 30 October 2026, 11:00 PM): not yet started. The plan is to reuse the TechExpo video, poster and Q&amp;A material.</w:t>
       </w:r>
     </w:p>
     <w:p>
@@ -313,27 +271,7 @@
           <w:sz w:val="24"/>
           <w:szCs w:val="24"/>
         </w:rPr>
-        <w:t xml:space="preserve">2.4 </w:t>
-      </w:r>
-      <w:proofErr w:type="spellStart"/>
-      <w:r>
-        <w:rPr>
-          <w:b/>
-          <w:bCs/>
-          <w:sz w:val="24"/>
-          <w:szCs w:val="24"/>
-        </w:rPr>
-        <w:t>TechExpo</w:t>
-      </w:r>
-      <w:proofErr w:type="spellEnd"/>
-      <w:r>
-        <w:rPr>
-          <w:b/>
-          <w:bCs/>
-          <w:sz w:val="24"/>
-          <w:szCs w:val="24"/>
-        </w:rPr>
-        <w:t xml:space="preserve"> Preparation</w:t>
+        <w:t xml:space="preserve">2.4 TechExpo Preparation</w:t>
       </w:r>
     </w:p>
     <w:p>
@@ -346,7 +284,7 @@
         <w:spacing w:after="60"/>
       </w:pPr>
       <w:r>
-        <w:t>Poster: the draft was shown to the sponsor and reviewed (feedback in Section 3). The redo is assigned to Tai Huynh.</w:t>
+        <w:t xml:space="preserve">Poster: the draft was shown to the supervisor and reviewed (feedback in Section 3). The redo is assigned to Tai Huynh.</w:t>
       </w:r>
     </w:p>
     <w:p>
@@ -359,15 +297,7 @@
         <w:spacing w:after="60"/>
       </w:pPr>
       <w:r>
-        <w:t xml:space="preserve">Video: the 2-minute </w:t>
-      </w:r>
-      <w:proofErr w:type="spellStart"/>
-      <w:r>
-        <w:t>TechExpo</w:t>
-      </w:r>
-      <w:proofErr w:type="spellEnd"/>
-      <w:r>
-        <w:t xml:space="preserve"> video is being finalised by Tai Huynh.</w:t>
+        <w:t xml:space="preserve">Video: the 2-minute TechExpo video is being finalised by Tai Huynh.</w:t>
       </w:r>
     </w:p>
     <w:p>
@@ -380,43 +310,7 @@
         <w:spacing w:after="60"/>
       </w:pPr>
       <w:r>
-        <w:t>Stall roles agreed at the internal group meeting on the same day: presenter / team lead (Thanh Binh Tran); technical explainers (</w:t>
-      </w:r>
-      <w:proofErr w:type="spellStart"/>
-      <w:r>
-        <w:t>Thi</w:t>
-      </w:r>
-      <w:proofErr w:type="spellEnd"/>
-      <w:r>
-        <w:t xml:space="preserve"> Hong Ngoc Nguyen, Thanh Binh Tran); Q&amp;A support (Tung Phuong Anh Huynh, </w:t>
-      </w:r>
-      <w:proofErr w:type="spellStart"/>
-      <w:r>
-        <w:t>Anmoldeep</w:t>
-      </w:r>
-      <w:proofErr w:type="spellEnd"/>
-      <w:r>
-        <w:t xml:space="preserve"> Singh and all members); live demo operators (Thanh Binh Tran, Tai Huynh, </w:t>
-      </w:r>
-      <w:r>
-        <w:t>Andre</w:t>
-      </w:r>
-      <w:r>
-        <w:t xml:space="preserve"> </w:t>
-      </w:r>
-      <w:proofErr w:type="spellStart"/>
-      <w:r>
-        <w:t>Namaratne</w:t>
-      </w:r>
-      <w:proofErr w:type="spellEnd"/>
-      <w:r>
-        <w:t xml:space="preserve">); stage, setup and backup support (Tai Huynh, </w:t>
-      </w:r>
-      <w:r>
-        <w:t>Andre</w:t>
-      </w:r>
-      <w:r>
-        <w:t xml:space="preserve"> Namaratne).</w:t>
+        <w:t xml:space="preserve">Stall roles agreed at the internal group meeting on the same day: presenter / team lead (Thanh Binh Tran); technical explainers (Thi Hong Ngoc Nguyen, Thanh Binh Tran); Q&amp;A support (Tung Phuong Anh Huynh, Anmoldeep Singh and all members); live demo operators (Thanh Binh Tran, Tai Huynh, Andre Namaratne); stage, setup and backup support (Tai Huynh, Andre Namaratne).</w:t>
       </w:r>
     </w:p>
     <w:p>
@@ -428,13 +322,8 @@
         </w:numPr>
         <w:spacing w:after="60"/>
       </w:pPr>
-      <w:proofErr w:type="spellStart"/>
-      <w:r>
-        <w:t>EduRAG</w:t>
-      </w:r>
-      <w:proofErr w:type="spellEnd"/>
-      <w:r>
-        <w:t xml:space="preserve"> vs general-purpose AI answer: prepared by Thanh Binh Tran, built around accuracy, relevance, customisation and augmentation, with local deployment as a secondary point.</w:t>
+      <w:r>
+        <w:t xml:space="preserve">EduRAG vs general-purpose AI answer: prepared by Thanh Binh Tran, built around accuracy, relevance, customisation and augmentation, with local deployment as a secondary point.</w:t>
       </w:r>
     </w:p>
     <w:p>
@@ -470,7 +359,7 @@
         <w:spacing w:after="80"/>
       </w:pPr>
       <w:r>
-        <w:t>Prof. Jun Yan reviewed the team's progress and confirmed the sponsor meeting outcomes below.</w:t>
+        <w:t xml:space="preserve">Prof. Jun Yan reviewed the team's progress and confirmed the supervisor meeting outcomes below.</w:t>
       </w:r>
     </w:p>
     <w:p>
@@ -483,7 +372,7 @@
         <w:spacing w:after="60"/>
       </w:pPr>
       <w:r>
-        <w:t>A5 documentation: check the A5 specification carefully and make sure the documentation addresses every marking criterion. The sponsor left this entirely to the team. A5 requires a project acceptance document signed by every team member, Dr John Le and the sponsor, and the sponsor will sign once he receives the link.</w:t>
+        <w:t xml:space="preserve">A5 documentation: check the A5 specification carefully and make sure the documentation addresses every marking criterion. The supervisor left this entirely to the team. A5 requires a project acceptance document signed by every team member, Dr John Le and the supervisor, and the supervisor will sign once he receives the link.</w:t>
       </w:r>
     </w:p>
     <w:p>
@@ -496,15 +385,7 @@
         <w:spacing w:after="60"/>
       </w:pPr>
       <w:r>
-        <w:t xml:space="preserve">Poster: the central screenshot takes up roughly a third to half of the poster and is too small to read, so it should be made smaller to free space for text, and small fonts should be enlarged. The wording ("smarter", "simpler", "one place for all course materials") makes </w:t>
-      </w:r>
-      <w:proofErr w:type="spellStart"/>
-      <w:r>
-        <w:t>EduRAG</w:t>
-      </w:r>
-      <w:proofErr w:type="spellEnd"/>
-      <w:r>
-        <w:t xml:space="preserve"> look like a simple document repository and does not show its main function. "Trusted" is a good word; the team should add adjectives that highlight the real features, differentiate the platform and help sell it. The poster is acceptable now but can be improved.</w:t>
+        <w:t xml:space="preserve">Poster: the central screenshot takes up roughly a third to half of the poster and is too small to read, so it should be made smaller to free space for text, and small fonts should be enlarged. The wording ("smarter", "simpler", "one place for all course materials") makes EduRAG look like a simple document repository and does not show its main function. "Trusted" is a good word; the team should add adjectives that highlight the real features, differentiate the platform and help sell it. The poster is acceptable now but can be improved.</w:t>
       </w:r>
     </w:p>
     <w:p>
@@ -516,21 +397,8 @@
         </w:numPr>
         <w:spacing w:after="60"/>
       </w:pPr>
-      <w:proofErr w:type="spellStart"/>
-      <w:r>
-        <w:t>TechExpo</w:t>
-      </w:r>
-      <w:proofErr w:type="spellEnd"/>
-      <w:r>
-        <w:t xml:space="preserve"> roles: besides the video, the team must be ready to demo and explain the project at the stall. One person should </w:t>
-      </w:r>
-      <w:proofErr w:type="gramStart"/>
-      <w:r>
-        <w:t>demonstrate,</w:t>
-      </w:r>
-      <w:proofErr w:type="gramEnd"/>
-      <w:r>
-        <w:t xml:space="preserve"> one should explain what the project is about, and all members should work together to answer questions. Roles should be agreed in advance.</w:t>
+      <w:r>
+        <w:t xml:space="preserve">TechExpo roles: besides the video, the team must be ready to demo and explain the project at the stall. One person should demonstrate, one should explain what the project is about, and all members should work together to answer questions. Roles should be agreed in advance.</w:t>
       </w:r>
     </w:p>
     <w:p>
@@ -543,23 +411,7 @@
         <w:spacing w:after="60"/>
       </w:pPr>
       <w:r>
-        <w:t>Differentiation (</w:t>
-      </w:r>
-      <w:proofErr w:type="spellStart"/>
-      <w:r>
-        <w:t>EduRAG</w:t>
-      </w:r>
-      <w:proofErr w:type="spellEnd"/>
-      <w:r>
-        <w:t xml:space="preserve"> vs general-purpose AI): judges and visitors will ask this, so the team must prepare it properly. The sponsor advised not to over-emphasise security or privacy, because AI providers offer controlled environments (for example Microsoft Copilot under the University subscription). The emphasis should be the strengths of RAG in education: data accuracy, relevance, customisation and augmentation, contrasted with general AI answers that may be comprehensive but inaccurate, outdated or irrelevant to the course. The team should be able to state clearly what value </w:t>
-      </w:r>
-      <w:proofErr w:type="spellStart"/>
-      <w:r>
-        <w:t>EduRAG</w:t>
-      </w:r>
-      <w:proofErr w:type="spellEnd"/>
-      <w:r>
-        <w:t xml:space="preserve"> adds over products already on the market.</w:t>
+        <w:t xml:space="preserve">Differentiation (EduRAG vs general-purpose AI): judges and visitors will ask this, so the team must prepare it properly. The supervisor advised not to over-emphasise security or privacy, because AI providers offer controlled environments (for example Microsoft Copilot under the University subscription). The emphasis should be the strengths of RAG in education: data accuracy, relevance, customisation and augmentation, contrasted with general AI answers that may be comprehensive but inaccurate, outdated or irrelevant to the course. The team should be able to state clearly what value EduRAG adds over products already on the market.</w:t>
       </w:r>
     </w:p>
     <w:p>
@@ -571,15 +423,8 @@
         </w:numPr>
         <w:spacing w:after="60"/>
       </w:pPr>
-      <w:proofErr w:type="spellStart"/>
-      <w:r>
-        <w:t>TechExpo</w:t>
-      </w:r>
-      <w:proofErr w:type="spellEnd"/>
-      <w:r>
-        <w:t xml:space="preserve"> format: the 2-minute video is played on the big stage screen for everyone, not looped at each stall, and teams may be asked onto the stage. Demos happen at each team's allocated stall, where judges with iPads listen to the demo and explanation and ask questions. Round 1 is stall judging, and the top teams (about the top 5) go through to a second round. The team should double-check the Expo date </w:t>
-      </w:r>
-      <w:r>
+      <w:r>
+        <w:t xml:space="preserve">TechExpo format: the 2-minute video is played on the big stage screen for everyone, not looped at each stall, and teams may be asked onto the stage. Demos happen at each team's allocated stall, where judges with iPads listen to the demo and explanation and ask questions. Round 1 is stall judging, and the top teams (about the top 5) go through to a second round. The team should double-check the Expo date </w:t>
         <w:lastRenderedPageBreak/>
         <w:t>and time (currently recorded as Tue 27 October 2026, 11:00 AM – 5:00 PM) and may ask the organisers for a monitor, although availability is not guaranteed.</w:t>
       </w:r>
@@ -594,15 +439,7 @@
         <w:spacing w:after="60"/>
       </w:pPr>
       <w:r>
-        <w:t xml:space="preserve">Timeline: per the current deadlines, A5 is due in 9 days (Fri 23 October 2026), the </w:t>
-      </w:r>
-      <w:proofErr w:type="spellStart"/>
-      <w:r>
-        <w:t>TechExpo</w:t>
-      </w:r>
-      <w:proofErr w:type="spellEnd"/>
-      <w:r>
-        <w:t xml:space="preserve"> is in 13 days (Tue 27 October 2026) and A6 is due in 16 days (Fri 30 October 2026). With the code frozen, the remaining time is for documentation, the poster, the video and demo preparation. The sponsor said the team is doing a good job overall and only needs to complete the last stretch.</w:t>
+        <w:t xml:space="preserve">Timeline: per the current deadlines, A5 is due in 9 days (Fri 23 October 2026), the TechExpo is in 13 days (Tue 27 October 2026) and A6 is due in 16 days (Fri 30 October 2026). With the code frozen, the remaining time is for documentation, the poster, the video and demo preparation. The supervisor said the team is doing a good job overall and only needs to complete the last stretch.</w:t>
       </w:r>
     </w:p>
     <w:p>
@@ -650,12 +487,6 @@
         <w:gridCol w:w="6626"/>
       </w:tblGrid>
       <w:tr>
-        <w:tblPrEx>
-          <w:tblCellMar>
-            <w:top w:w="0" w:type="dxa"/>
-            <w:bottom w:w="0" w:type="dxa"/>
-          </w:tblCellMar>
-        </w:tblPrEx>
         <w:trPr>
           <w:tblHeader/>
         </w:trPr>
@@ -719,12 +550,6 @@
         </w:tc>
       </w:tr>
       <w:tr>
-        <w:tblPrEx>
-          <w:tblCellMar>
-            <w:top w:w="0" w:type="dxa"/>
-            <w:bottom w:w="0" w:type="dxa"/>
-          </w:tblCellMar>
-        </w:tblPrEx>
         <w:tc>
           <w:tcPr>
             <w:tcW w:w="2400" w:type="dxa"/>
@@ -773,32 +598,12 @@
               <w:rPr>
                 <w:color w:val="000000"/>
               </w:rPr>
-              <w:t xml:space="preserve">Reviewed; satisfied overall. Prof. Jun Yan said at the 14 October 2026 sponsor meeting that the team is doing a good job overall, and set follow-up actions for the poster, the </w:t>
-            </w:r>
-            <w:proofErr w:type="spellStart"/>
-            <w:r>
-              <w:rPr>
-                <w:color w:val="000000"/>
-              </w:rPr>
-              <w:t>EduRAG</w:t>
-            </w:r>
-            <w:proofErr w:type="spellEnd"/>
-            <w:r>
-              <w:rPr>
-                <w:color w:val="000000"/>
-              </w:rPr>
-              <w:t xml:space="preserve"> vs general-AI answer, the stall roles and the signed acceptance document. The updated lecturer approval flow could not be viewed by the sponsor because of screen-share quality, so it was not verified in the meeting.</w:t>
+              <w:t xml:space="preserve">Reviewed; satisfied overall. Prof. Jun Yan said at the 14 October 2026 supervisor meeting that the team is doing a good job overall, and set follow-up actions for the poster, the EduRAG vs general-AI answer, the stall roles and the signed acceptance document. The updated lecturer approval flow could not be viewed by the supervisor because of screen-share quality, so it was not verified in the meeting.</w:t>
             </w:r>
           </w:p>
         </w:tc>
       </w:tr>
       <w:tr>
-        <w:tblPrEx>
-          <w:tblCellMar>
-            <w:top w:w="0" w:type="dxa"/>
-            <w:bottom w:w="0" w:type="dxa"/>
-          </w:tblCellMar>
-        </w:tblPrEx>
         <w:tc>
           <w:tcPr>
             <w:tcW w:w="2400" w:type="dxa"/>
@@ -849,18 +654,12 @@
               <w:rPr>
                 <w:color w:val="000000"/>
               </w:rPr>
-              <w:t xml:space="preserve">Sponsor Meeting (Meeting No. 23) — 14 October 2026, 11:00 – 11:40 AM, Webex. This sponsor review document is the meeting record, filed at docs/meetings/sprint11_sponsor_review.docx. </w:t>
+              <w:t xml:space="preserve">Supervisor Meeting (Meeting No. 23) — 14 October 2026, 11:00 – 11:40 AM, Webex. This supervisor review document is the meeting record, filed at docs/meetings/sprint11_supervisor_review.docx. </w:t>
             </w:r>
           </w:p>
         </w:tc>
       </w:tr>
       <w:tr>
-        <w:tblPrEx>
-          <w:tblCellMar>
-            <w:top w:w="0" w:type="dxa"/>
-            <w:bottom w:w="0" w:type="dxa"/>
-          </w:tblCellMar>
-        </w:tblPrEx>
         <w:tc>
           <w:tcPr>
             <w:tcW w:w="2400" w:type="dxa"/>
@@ -909,60 +708,12 @@
               <w:rPr>
                 <w:color w:val="000000"/>
               </w:rPr>
-              <w:t xml:space="preserve">Prof. Jun Yan satisfied with overall progress. Key feedback: (1) Check A5 against every marking criterion and collect all signatures on the project acceptance document; (2) Redo the poster: smaller screenshot, larger text, adjectives that show the RAG function and differentiate </w:t>
-            </w:r>
-            <w:proofErr w:type="spellStart"/>
-            <w:r>
-              <w:rPr>
-                <w:color w:val="000000"/>
-              </w:rPr>
-              <w:t>EduRAG</w:t>
-            </w:r>
-            <w:proofErr w:type="spellEnd"/>
-            <w:r>
-              <w:rPr>
-                <w:color w:val="000000"/>
-              </w:rPr>
-              <w:t xml:space="preserve">; (3) Prepare the </w:t>
-            </w:r>
-            <w:proofErr w:type="spellStart"/>
-            <w:r>
-              <w:rPr>
-                <w:color w:val="000000"/>
-              </w:rPr>
-              <w:t>EduRAG</w:t>
-            </w:r>
-            <w:proofErr w:type="spellEnd"/>
-            <w:r>
-              <w:rPr>
-                <w:color w:val="000000"/>
-              </w:rPr>
-              <w:t xml:space="preserve"> vs general-AI answer around accuracy, relevance, customisation and augmentation, not mainly security; (4) Agree stall roles for demo, explanation and Q&amp;A; (5) A5 due 23 October, </w:t>
-            </w:r>
-            <w:proofErr w:type="spellStart"/>
-            <w:r>
-              <w:rPr>
-                <w:color w:val="000000"/>
-              </w:rPr>
-              <w:t>TechExpo</w:t>
-            </w:r>
-            <w:proofErr w:type="spellEnd"/>
-            <w:r>
-              <w:rPr>
-                <w:color w:val="000000"/>
-              </w:rPr>
-              <w:t xml:space="preserve"> 27 October (confirm date/time), A6 due 30 October.</w:t>
+              <w:t xml:space="preserve">Prof. Jun Yan satisfied with overall progress. Key feedback: (1) Check A5 against every marking criterion and collect all signatures on the project acceptance document; (2) Redo the poster: smaller screenshot, larger text, adjectives that show the RAG function and differentiate EduRAG; (3) Prepare the EduRAG vs general-AI answer around accuracy, relevance, customisation and augmentation, not mainly security; (4) Agree stall roles for demo, explanation and Q&amp;A; (5) A5 due 23 October, TechExpo 27 October (confirm date/time), A6 due 30 October.</w:t>
             </w:r>
           </w:p>
         </w:tc>
       </w:tr>
       <w:tr>
-        <w:tblPrEx>
-          <w:tblCellMar>
-            <w:top w:w="0" w:type="dxa"/>
-            <w:bottom w:w="0" w:type="dxa"/>
-          </w:tblCellMar>
-        </w:tblPrEx>
         <w:tc>
           <w:tcPr>
             <w:tcW w:w="2400" w:type="dxa"/>
@@ -1013,7 +764,7 @@
               <w:rPr>
                 <w:color w:val="000000"/>
               </w:rPr>
-              <w:t>Review status is confirmed as reviewed, satisfied overall, with follow-up actions outstanding, based on the 14 October 2026 sponsor meeting (Prof. Jun Yan).</w:t>
+              <w:t xml:space="preserve">Review status is confirmed as reviewed, satisfied overall, with follow-up actions outstanding, based on the 14 October 2026 supervisor meeting (Prof. Jun Yan).</w:t>
             </w:r>
           </w:p>
         </w:tc>
@@ -1057,12 +808,6 @@
         <w:gridCol w:w="3326"/>
       </w:tblGrid>
       <w:tr>
-        <w:tblPrEx>
-          <w:tblCellMar>
-            <w:top w:w="0" w:type="dxa"/>
-            <w:bottom w:w="0" w:type="dxa"/>
-          </w:tblCellMar>
-        </w:tblPrEx>
         <w:trPr>
           <w:tblHeader/>
         </w:trPr>
@@ -1155,12 +900,6 @@
         </w:tc>
       </w:tr>
       <w:tr>
-        <w:tblPrEx>
-          <w:tblCellMar>
-            <w:top w:w="0" w:type="dxa"/>
-            <w:bottom w:w="0" w:type="dxa"/>
-          </w:tblCellMar>
-        </w:tblPrEx>
         <w:tc>
           <w:tcPr>
             <w:tcW w:w="2700" w:type="dxa"/>
@@ -1183,7 +922,7 @@
               <w:rPr>
                 <w:color w:val="000000"/>
               </w:rPr>
-              <w:t>Poster not yet redone to the sponsor feedback</w:t>
+              <w:t xml:space="preserve">Poster not yet redone to the supervisor feedback</w:t>
             </w:r>
           </w:p>
         </w:tc>
@@ -1209,16 +948,8 @@
               <w:rPr>
                 <w:color w:val="000000"/>
               </w:rPr>
-              <w:t xml:space="preserve">The current poster may undersell the RAG function at the </w:t>
-            </w:r>
-            <w:proofErr w:type="spellStart"/>
-            <w:r>
-              <w:rPr>
-                <w:color w:val="000000"/>
-              </w:rPr>
-              <w:t>TechExpo</w:t>
-            </w:r>
-            <w:proofErr w:type="spellEnd"/>
+              <w:t xml:space="preserve">The current poster may undersell the RAG function at the TechExpo</w:t>
+            </w:r>
           </w:p>
         </w:tc>
         <w:tc>
@@ -1249,12 +980,6 @@
         </w:tc>
       </w:tr>
       <w:tr>
-        <w:tblPrEx>
-          <w:tblCellMar>
-            <w:top w:w="0" w:type="dxa"/>
-            <w:bottom w:w="0" w:type="dxa"/>
-          </w:tblCellMar>
-        </w:tblPrEx>
         <w:tc>
           <w:tcPr>
             <w:tcW w:w="2700" w:type="dxa"/>
@@ -1278,7 +1003,7 @@
               <w:rPr>
                 <w:color w:val="000000"/>
               </w:rPr>
-              <w:t>Updated lecturer approval flow could not be shown to the sponsor (blurry screen share)</w:t>
+              <w:t xml:space="preserve">Updated lecturer approval flow could not be shown to the supervisor (blurry screen share)</w:t>
             </w:r>
           </w:p>
         </w:tc>
@@ -1305,16 +1030,8 @@
               <w:rPr>
                 <w:color w:val="000000"/>
               </w:rPr>
-              <w:t xml:space="preserve">Sponsor has not directly seen the new flow; same risk of a poor display on the </w:t>
-            </w:r>
-            <w:proofErr w:type="gramStart"/>
-            <w:r>
-              <w:rPr>
-                <w:color w:val="000000"/>
-              </w:rPr>
-              <w:t>Expo day</w:t>
-            </w:r>
-            <w:proofErr w:type="gramEnd"/>
+              <w:t xml:space="preserve">Supervisor has not directly seen the new flow; same risk of a poor display on the Expo day</w:t>
+            </w:r>
           </w:p>
         </w:tc>
         <w:tc>
@@ -1346,12 +1063,6 @@
         </w:tc>
       </w:tr>
       <w:tr>
-        <w:tblPrEx>
-          <w:tblCellMar>
-            <w:top w:w="0" w:type="dxa"/>
-            <w:bottom w:w="0" w:type="dxa"/>
-          </w:tblCellMar>
-        </w:tblPrEx>
         <w:tc>
           <w:tcPr>
             <w:tcW w:w="2700" w:type="dxa"/>
@@ -1374,21 +1085,8 @@
               <w:rPr>
                 <w:color w:val="000000"/>
               </w:rPr>
-              <w:t xml:space="preserve">2-minute </w:t>
-            </w:r>
-            <w:proofErr w:type="spellStart"/>
-            <w:r>
-              <w:rPr>
-                <w:color w:val="000000"/>
-              </w:rPr>
-              <w:t>TechExpo</w:t>
-            </w:r>
-            <w:proofErr w:type="spellEnd"/>
-            <w:r>
-              <w:rPr>
-                <w:color w:val="000000"/>
-              </w:rPr>
-              <w:t xml:space="preserve"> video not yet finalised</w:t>
+              <w:lastRenderedPageBreak/>
+              <w:t xml:space="preserve">2-minute TechExpo video not yet finalised</w:t>
             </w:r>
           </w:p>
         </w:tc>
@@ -1446,12 +1144,6 @@
         </w:tc>
       </w:tr>
       <w:tr>
-        <w:tblPrEx>
-          <w:tblCellMar>
-            <w:top w:w="0" w:type="dxa"/>
-            <w:bottom w:w="0" w:type="dxa"/>
-          </w:tblCellMar>
-        </w:tblPrEx>
         <w:tc>
           <w:tcPr>
             <w:tcW w:w="2700" w:type="dxa"/>
@@ -1475,7 +1167,6 @@
               <w:rPr>
                 <w:color w:val="000000"/>
               </w:rPr>
-              <w:lastRenderedPageBreak/>
               <w:t>Project acceptance document signatures outstanding</w:t>
             </w:r>
           </w:p>
@@ -1530,18 +1221,12 @@
               <w:rPr>
                 <w:color w:val="000000"/>
               </w:rPr>
-              <w:t>Thanh Binh Tran to follow up; sponsor will sign once he receives the link</w:t>
+              <w:t xml:space="preserve">Thanh Binh Tran to follow up; supervisor will sign once he receives the link</w:t>
             </w:r>
           </w:p>
         </w:tc>
       </w:tr>
       <w:tr>
-        <w:tblPrEx>
-          <w:tblCellMar>
-            <w:top w:w="0" w:type="dxa"/>
-            <w:bottom w:w="0" w:type="dxa"/>
-          </w:tblCellMar>
-        </w:tblPrEx>
         <w:tc>
           <w:tcPr>
             <w:tcW w:w="2700" w:type="dxa"/>
@@ -1661,12 +1346,6 @@
         <w:gridCol w:w="2300"/>
       </w:tblGrid>
       <w:tr>
-        <w:tblPrEx>
-          <w:tblCellMar>
-            <w:top w:w="0" w:type="dxa"/>
-            <w:bottom w:w="0" w:type="dxa"/>
-          </w:tblCellMar>
-        </w:tblPrEx>
         <w:trPr>
           <w:tblHeader/>
         </w:trPr>
@@ -1759,12 +1438,6 @@
         </w:tc>
       </w:tr>
       <w:tr>
-        <w:tblPrEx>
-          <w:tblCellMar>
-            <w:top w:w="0" w:type="dxa"/>
-            <w:bottom w:w="0" w:type="dxa"/>
-          </w:tblCellMar>
-        </w:tblPrEx>
         <w:tc>
           <w:tcPr>
             <w:tcW w:w="700" w:type="dxa"/>
@@ -1813,7 +1486,7 @@
               <w:rPr>
                 <w:color w:val="000000"/>
               </w:rPr>
-              <w:t>Redo the poster according to the sponsor comments: smaller screenshot, larger text and adjectives that show the RAG function.</w:t>
+              <w:t xml:space="preserve">Redo the poster according to the supervisor comments: smaller screenshot, larger text and adjectives that show the RAG function.</w:t>
             </w:r>
           </w:p>
         </w:tc>
@@ -1845,12 +1518,6 @@
         </w:tc>
       </w:tr>
       <w:tr>
-        <w:tblPrEx>
-          <w:tblCellMar>
-            <w:top w:w="0" w:type="dxa"/>
-            <w:bottom w:w="0" w:type="dxa"/>
-          </w:tblCellMar>
-        </w:tblPrEx>
         <w:tc>
           <w:tcPr>
             <w:tcW w:w="700" w:type="dxa"/>
@@ -1901,21 +1568,7 @@
               <w:rPr>
                 <w:color w:val="000000"/>
               </w:rPr>
-              <w:t xml:space="preserve">Prepare a clear </w:t>
-            </w:r>
-            <w:proofErr w:type="spellStart"/>
-            <w:r>
-              <w:rPr>
-                <w:color w:val="000000"/>
-              </w:rPr>
-              <w:t>EduRAG</w:t>
-            </w:r>
-            <w:proofErr w:type="spellEnd"/>
-            <w:r>
-              <w:rPr>
-                <w:color w:val="000000"/>
-              </w:rPr>
-              <w:t xml:space="preserve"> vs general-AI answer focused on accuracy, relevance, customisation and augmentation.</w:t>
+              <w:t xml:space="preserve">Prepare a clear EduRAG vs general-AI answer focused on accuracy, relevance, customisation and augmentation.</w:t>
             </w:r>
           </w:p>
         </w:tc>
@@ -1948,12 +1601,6 @@
         </w:tc>
       </w:tr>
       <w:tr>
-        <w:tblPrEx>
-          <w:tblCellMar>
-            <w:top w:w="0" w:type="dxa"/>
-            <w:bottom w:w="0" w:type="dxa"/>
-          </w:tblCellMar>
-        </w:tblPrEx>
         <w:tc>
           <w:tcPr>
             <w:tcW w:w="700" w:type="dxa"/>
@@ -2034,12 +1681,6 @@
         </w:tc>
       </w:tr>
       <w:tr>
-        <w:tblPrEx>
-          <w:tblCellMar>
-            <w:top w:w="0" w:type="dxa"/>
-            <w:bottom w:w="0" w:type="dxa"/>
-          </w:tblCellMar>
-        </w:tblPrEx>
         <w:tc>
           <w:tcPr>
             <w:tcW w:w="700" w:type="dxa"/>
@@ -2134,25 +1775,7 @@
           <w:iCs/>
           <w:color w:val="000000"/>
         </w:rPr>
-        <w:t xml:space="preserve">Document prepared by: Tung Phuong Anh </w:t>
-      </w:r>
-      <w:proofErr w:type="gramStart"/>
-      <w:r>
-        <w:rPr>
-          <w:i/>
-          <w:iCs/>
-          <w:color w:val="000000"/>
-        </w:rPr>
-        <w:t>Huynh  |</w:t>
-      </w:r>
-      <w:proofErr w:type="gramEnd"/>
-      <w:r>
-        <w:rPr>
-          <w:i/>
-          <w:iCs/>
-          <w:color w:val="000000"/>
-        </w:rPr>
-        <w:t xml:space="preserve">  CSIT321 Project 37, Group 19</w:t>
+        <w:t xml:space="preserve">Document prepared by: Tung Phuong Anh Huynh  |  CSIT321 Project 37, Group 19</w:t>
       </w:r>
     </w:p>
     <w:sectPr>

</xml_diff>